<commit_message>
Refine report format and style
Signed-off-by: Luis Liu <vangork@live.com>
</commit_message>
<xml_diff>
--- a/dnaseqc/inst/extdata/quartet_template.docx
+++ b/dnaseqc/inst/extdata/quartet_template.docx
@@ -1,26 +1,32 @@
 
 <file path=word/document.xml><?xml version="1.0" encoding="utf-8"?>
-<w:document xmlns:wpc="http://schemas.microsoft.com/office/word/2010/wordprocessingCanvas" xmlns:cx="http://schemas.microsoft.com/office/drawing/2014/chartex" xmlns:cx1="http://schemas.microsoft.com/office/drawing/2015/9/8/chartex" xmlns:cx2="http://schemas.microsoft.com/office/drawing/2015/10/21/chartex" xmlns:cx3="http://schemas.microsoft.com/office/drawing/2016/5/9/chartex" xmlns:cx4="http://schemas.microsoft.com/office/drawing/2016/5/10/chartex" xmlns:cx5="http://schemas.microsoft.com/office/drawing/2016/5/11/chartex" xmlns:cx6="http://schemas.microsoft.com/office/drawing/2016/5/12/chartex" xmlns:cx7="http://schemas.microsoft.com/office/drawing/2016/5/13/chartex" xmlns:cx8="http://schemas.microsoft.com/office/drawing/2016/5/14/chartex" xmlns:mc="http://schemas.openxmlformats.org/markup-compatibility/2006" xmlns:aink="http://schemas.microsoft.com/office/drawing/2016/ink" xmlns:am3d="http://schemas.microsoft.com/office/drawing/2017/model3d" xmlns:o="urn:schemas-microsoft-com:office:office" xmlns:oel="http://schemas.microsoft.com/office/2019/extlst" xmlns:r="http://schemas.openxmlformats.org/officeDocument/2006/relationships" xmlns:m="http://schemas.openxmlformats.org/officeDocument/2006/math" xmlns:v="urn:schemas-microsoft-com:vml" xmlns:wp14="http://schemas.microsoft.com/office/word/2010/wordprocessingDrawing" xmlns:wp="http://schemas.openxmlformats.org/drawingml/2006/wordprocessingDrawing" xmlns:w10="urn:schemas-microsoft-com:office:word" xmlns:w="http://schemas.openxmlformats.org/wordprocessingml/2006/main" xmlns:w14="http://schemas.microsoft.com/office/word/2010/wordml" xmlns:w15="http://schemas.microsoft.com/office/word/2012/wordml" xmlns:w16cex="http://schemas.microsoft.com/office/word/2018/wordml/cex" xmlns:w16cid="http://schemas.microsoft.com/office/word/2016/wordml/cid" xmlns:w16="http://schemas.microsoft.com/office/word/2018/wordml" xmlns:w16sdtdh="http://schemas.microsoft.com/office/word/2020/wordml/sdtdatahash" xmlns:w16se="http://schemas.microsoft.com/office/word/2015/wordml/symex" xmlns:wpg="http://schemas.microsoft.com/office/word/2010/wordprocessingGroup" xmlns:wpi="http://schemas.microsoft.com/office/word/2010/wordprocessingInk" xmlns:wne="http://schemas.microsoft.com/office/word/2006/wordml" xmlns:wps="http://schemas.microsoft.com/office/word/2010/wordprocessingShape" mc:Ignorable="w14 w15 w16se w16cid w16 w16cex w16sdtdh wp14">
+<w:document xmlns:wpc="http://schemas.microsoft.com/office/word/2010/wordprocessingCanvas" xmlns:cx="http://schemas.microsoft.com/office/drawing/2014/chartex" xmlns:cx1="http://schemas.microsoft.com/office/drawing/2015/9/8/chartex" xmlns:cx2="http://schemas.microsoft.com/office/drawing/2015/10/21/chartex" xmlns:cx3="http://schemas.microsoft.com/office/drawing/2016/5/9/chartex" xmlns:cx4="http://schemas.microsoft.com/office/drawing/2016/5/10/chartex" xmlns:cx5="http://schemas.microsoft.com/office/drawing/2016/5/11/chartex" xmlns:cx6="http://schemas.microsoft.com/office/drawing/2016/5/12/chartex" xmlns:cx7="http://schemas.microsoft.com/office/drawing/2016/5/13/chartex" xmlns:cx8="http://schemas.microsoft.com/office/drawing/2016/5/14/chartex" xmlns:mc="http://schemas.openxmlformats.org/markup-compatibility/2006" xmlns:aink="http://schemas.microsoft.com/office/drawing/2016/ink" xmlns:am3d="http://schemas.microsoft.com/office/drawing/2017/model3d" xmlns:o="urn:schemas-microsoft-com:office:office" xmlns:oel="http://schemas.microsoft.com/office/2019/extlst" xmlns:r="http://schemas.openxmlformats.org/officeDocument/2006/relationships" xmlns:m="http://schemas.openxmlformats.org/officeDocument/2006/math" xmlns:v="urn:schemas-microsoft-com:vml" xmlns:wp14="http://schemas.microsoft.com/office/word/2010/wordprocessingDrawing" xmlns:wp="http://schemas.openxmlformats.org/drawingml/2006/wordprocessingDrawing" xmlns:w10="urn:schemas-microsoft-com:office:word" xmlns:w="http://schemas.openxmlformats.org/wordprocessingml/2006/main" xmlns:w14="http://schemas.microsoft.com/office/word/2010/wordml" xmlns:w15="http://schemas.microsoft.com/office/word/2012/wordml" xmlns:w16cex="http://schemas.microsoft.com/office/word/2018/wordml/cex" xmlns:w16cid="http://schemas.microsoft.com/office/word/2016/wordml/cid" xmlns:w16="http://schemas.microsoft.com/office/word/2018/wordml" xmlns:w16du="http://schemas.microsoft.com/office/word/2023/wordml/word16du" xmlns:w16sdtdh="http://schemas.microsoft.com/office/word/2020/wordml/sdtdatahash" xmlns:w16sdtfl="http://schemas.microsoft.com/office/word/2024/wordml/sdtformatlock" xmlns:w16se="http://schemas.microsoft.com/office/word/2015/wordml/symex" xmlns:wpg="http://schemas.microsoft.com/office/word/2010/wordprocessingGroup" xmlns:wpi="http://schemas.microsoft.com/office/word/2010/wordprocessingInk" xmlns:wne="http://schemas.microsoft.com/office/word/2006/wordml" xmlns:wps="http://schemas.microsoft.com/office/word/2010/wordprocessingShape" mc:Ignorable="w14 w15 w16se w16cid w16 w16cex w16sdtdh w16sdtfl w16du wp14">
   <w:body>
     <w:p>
       <w:pPr>
-        <w:jc w:val="right"/>
+        <w:jc w:val="left"/>
+        <w:rPr>
+          <w:rFonts w:eastAsiaTheme="minorEastAsia" w:cs="Times New Roman"/>
+          <w:sz w:val="22"/>
+          <w:szCs w:val="22"/>
+          <w:lang w:eastAsia="zh-CN"/>
+        </w:rPr>
       </w:pPr>
-      <w:bookmarkStart w:id="0" w:name="OLE_LINK45"/>
+      <w:bookmarkStart w:id="0" w:name="OLE_LINK1"/>
       <w:bookmarkStart w:id="1" w:name="OLE_LINK44"/>
-      <w:bookmarkStart w:id="2" w:name="OLE_LINK2"/>
-      <w:bookmarkStart w:id="3" w:name="OLE_LINK1"/>
+      <w:bookmarkStart w:id="2" w:name="OLE_LINK45"/>
+      <w:bookmarkStart w:id="3" w:name="OLE_LINK2"/>
       <w:r>
         <w:rPr>
-          <w:rFonts w:ascii="Times New Roman" w:eastAsia="宋体" w:hAnsi="Times New Roman" w:cs="Times New Roman"/>
+          <w:rFonts w:eastAsiaTheme="minorEastAsia" w:cs="Times New Roman"/>
           <w:b/>
           <w:bCs/>
           <w:noProof/>
-          <w:sz w:val="20"/>
-          <w:szCs w:val="20"/>
+          <w:sz w:val="22"/>
+          <w:szCs w:val="22"/>
         </w:rPr>
         <w:drawing>
-          <wp:anchor distT="0" distB="0" distL="114300" distR="114300" simplePos="0" relativeHeight="251659264" behindDoc="0" locked="0" layoutInCell="1" allowOverlap="1">
+          <wp:anchor distT="0" distB="0" distL="114300" distR="114300" simplePos="0" relativeHeight="251659264" behindDoc="0" locked="0" layoutInCell="1" allowOverlap="1" wp14:anchorId="3F931C50" wp14:editId="09B1F1D2">
             <wp:simplePos x="0" y="0"/>
             <wp:positionH relativeFrom="margin">
               <wp:posOffset>0</wp:posOffset>
@@ -45,7 +51,7 @@
                     </pic:cNvPicPr>
                   </pic:nvPicPr>
                   <pic:blipFill>
-                    <a:blip r:embed="rId6" cstate="print">
+                    <a:blip r:embed="rId7" cstate="print">
                       <a:extLst>
                         <a:ext uri="{28A0092B-C50C-407E-A947-70E740481C1C}">
                           <a14:useLocalDpi xmlns:a14="http://schemas.microsoft.com/office/drawing/2010/main" val="0"/>
@@ -71,56 +77,32 @@
           </wp:anchor>
         </w:drawing>
       </w:r>
-      <w:r>
-        <w:rPr>
-          <w:noProof/>
-        </w:rPr>
-        <w:drawing>
-          <wp:inline distT="0" distB="0" distL="114300" distR="114300">
-            <wp:extent cx="1061720" cy="719455"/>
-            <wp:effectExtent l="0" t="0" r="5080" b="4445"/>
-            <wp:docPr id="1450359124" name="图片 2"/>
-            <wp:cNvGraphicFramePr>
-              <a:graphicFrameLocks xmlns:a="http://schemas.openxmlformats.org/drawingml/2006/main" noChangeAspect="1"/>
-            </wp:cNvGraphicFramePr>
-            <a:graphic xmlns:a="http://schemas.openxmlformats.org/drawingml/2006/main">
-              <a:graphicData uri="http://schemas.openxmlformats.org/drawingml/2006/picture">
-                <pic:pic xmlns:pic="http://schemas.openxmlformats.org/drawingml/2006/picture">
-                  <pic:nvPicPr>
-                    <pic:cNvPr id="1450359124" name="图片 2"/>
-                    <pic:cNvPicPr>
-                      <a:picLocks noChangeAspect="1"/>
-                    </pic:cNvPicPr>
-                  </pic:nvPicPr>
-                  <pic:blipFill>
-                    <a:blip r:embed="rId7"/>
-                    <a:stretch>
-                      <a:fillRect/>
-                    </a:stretch>
-                  </pic:blipFill>
-                  <pic:spPr>
-                    <a:xfrm>
-                      <a:off x="0" y="0"/>
-                      <a:ext cx="1062000" cy="720000"/>
-                    </a:xfrm>
-                    <a:prstGeom prst="rect">
-                      <a:avLst/>
-                    </a:prstGeom>
-                    <a:noFill/>
-                    <a:ln>
-                      <a:noFill/>
-                    </a:ln>
-                  </pic:spPr>
-                </pic:pic>
-              </a:graphicData>
-            </a:graphic>
-          </wp:inline>
-        </w:drawing>
-      </w:r>
       <w:bookmarkEnd w:id="0"/>
       <w:bookmarkEnd w:id="1"/>
       <w:bookmarkEnd w:id="2"/>
       <w:bookmarkEnd w:id="3"/>
+    </w:p>
+    <w:p>
+      <w:pPr>
+        <w:pStyle w:val="2"/>
+        <w:jc w:val="center"/>
+        <w:rPr>
+          <w:rFonts w:ascii="宋体" w:eastAsia="宋体" w:hAnsi="宋体" w:cs="Times New Roman"/>
+          <w:sz w:val="32"/>
+          <w:szCs w:val="32"/>
+        </w:rPr>
+      </w:pPr>
+    </w:p>
+    <w:p>
+      <w:pPr>
+        <w:jc w:val="left"/>
+        <w:rPr>
+          <w:rFonts w:cs="Times New Roman"/>
+          <w:sz w:val="22"/>
+          <w:szCs w:val="22"/>
+          <w:lang w:eastAsia="zh-CN"/>
+        </w:rPr>
+      </w:pPr>
     </w:p>
     <w:sectPr>
       <w:footerReference w:type="even" r:id="rId8"/>
@@ -136,7 +118,7 @@
 </file>
 
 <file path=word/endnotes.xml><?xml version="1.0" encoding="utf-8"?>
-<w:endnotes xmlns:wpc="http://schemas.microsoft.com/office/word/2010/wordprocessingCanvas" xmlns:cx="http://schemas.microsoft.com/office/drawing/2014/chartex" xmlns:cx1="http://schemas.microsoft.com/office/drawing/2015/9/8/chartex" xmlns:cx2="http://schemas.microsoft.com/office/drawing/2015/10/21/chartex" xmlns:cx3="http://schemas.microsoft.com/office/drawing/2016/5/9/chartex" xmlns:cx4="http://schemas.microsoft.com/office/drawing/2016/5/10/chartex" xmlns:cx5="http://schemas.microsoft.com/office/drawing/2016/5/11/chartex" xmlns:cx6="http://schemas.microsoft.com/office/drawing/2016/5/12/chartex" xmlns:cx7="http://schemas.microsoft.com/office/drawing/2016/5/13/chartex" xmlns:cx8="http://schemas.microsoft.com/office/drawing/2016/5/14/chartex" xmlns:mc="http://schemas.openxmlformats.org/markup-compatibility/2006" xmlns:aink="http://schemas.microsoft.com/office/drawing/2016/ink" xmlns:am3d="http://schemas.microsoft.com/office/drawing/2017/model3d" xmlns:o="urn:schemas-microsoft-com:office:office" xmlns:oel="http://schemas.microsoft.com/office/2019/extlst" xmlns:r="http://schemas.openxmlformats.org/officeDocument/2006/relationships" xmlns:m="http://schemas.openxmlformats.org/officeDocument/2006/math" xmlns:v="urn:schemas-microsoft-com:vml" xmlns:wp14="http://schemas.microsoft.com/office/word/2010/wordprocessingDrawing" xmlns:wp="http://schemas.openxmlformats.org/drawingml/2006/wordprocessingDrawing" xmlns:w10="urn:schemas-microsoft-com:office:word" xmlns:w="http://schemas.openxmlformats.org/wordprocessingml/2006/main" xmlns:w14="http://schemas.microsoft.com/office/word/2010/wordml" xmlns:w15="http://schemas.microsoft.com/office/word/2012/wordml" xmlns:w16cex="http://schemas.microsoft.com/office/word/2018/wordml/cex" xmlns:w16cid="http://schemas.microsoft.com/office/word/2016/wordml/cid" xmlns:w16="http://schemas.microsoft.com/office/word/2018/wordml" xmlns:w16sdtdh="http://schemas.microsoft.com/office/word/2020/wordml/sdtdatahash" xmlns:w16se="http://schemas.microsoft.com/office/word/2015/wordml/symex" xmlns:wpg="http://schemas.microsoft.com/office/word/2010/wordprocessingGroup" xmlns:wpi="http://schemas.microsoft.com/office/word/2010/wordprocessingInk" xmlns:wne="http://schemas.microsoft.com/office/word/2006/wordml" xmlns:wps="http://schemas.microsoft.com/office/word/2010/wordprocessingShape" mc:Ignorable="w14 w15 w16se w16cid w16 w16cex w16sdtdh wp14">
+<w:endnotes xmlns:wpc="http://schemas.microsoft.com/office/word/2010/wordprocessingCanvas" xmlns:cx="http://schemas.microsoft.com/office/drawing/2014/chartex" xmlns:cx1="http://schemas.microsoft.com/office/drawing/2015/9/8/chartex" xmlns:cx2="http://schemas.microsoft.com/office/drawing/2015/10/21/chartex" xmlns:cx3="http://schemas.microsoft.com/office/drawing/2016/5/9/chartex" xmlns:cx4="http://schemas.microsoft.com/office/drawing/2016/5/10/chartex" xmlns:cx5="http://schemas.microsoft.com/office/drawing/2016/5/11/chartex" xmlns:cx6="http://schemas.microsoft.com/office/drawing/2016/5/12/chartex" xmlns:cx7="http://schemas.microsoft.com/office/drawing/2016/5/13/chartex" xmlns:cx8="http://schemas.microsoft.com/office/drawing/2016/5/14/chartex" xmlns:mc="http://schemas.openxmlformats.org/markup-compatibility/2006" xmlns:aink="http://schemas.microsoft.com/office/drawing/2016/ink" xmlns:am3d="http://schemas.microsoft.com/office/drawing/2017/model3d" xmlns:o="urn:schemas-microsoft-com:office:office" xmlns:oel="http://schemas.microsoft.com/office/2019/extlst" xmlns:r="http://schemas.openxmlformats.org/officeDocument/2006/relationships" xmlns:m="http://schemas.openxmlformats.org/officeDocument/2006/math" xmlns:v="urn:schemas-microsoft-com:vml" xmlns:wp14="http://schemas.microsoft.com/office/word/2010/wordprocessingDrawing" xmlns:wp="http://schemas.openxmlformats.org/drawingml/2006/wordprocessingDrawing" xmlns:w10="urn:schemas-microsoft-com:office:word" xmlns:w="http://schemas.openxmlformats.org/wordprocessingml/2006/main" xmlns:w14="http://schemas.microsoft.com/office/word/2010/wordml" xmlns:w15="http://schemas.microsoft.com/office/word/2012/wordml" xmlns:w16cex="http://schemas.microsoft.com/office/word/2018/wordml/cex" xmlns:w16cid="http://schemas.microsoft.com/office/word/2016/wordml/cid" xmlns:w16="http://schemas.microsoft.com/office/word/2018/wordml" xmlns:w16du="http://schemas.microsoft.com/office/word/2023/wordml/word16du" xmlns:w16sdtdh="http://schemas.microsoft.com/office/word/2020/wordml/sdtdatahash" xmlns:w16sdtfl="http://schemas.microsoft.com/office/word/2024/wordml/sdtformatlock" xmlns:w16se="http://schemas.microsoft.com/office/word/2015/wordml/symex" xmlns:wpg="http://schemas.microsoft.com/office/word/2010/wordprocessingGroup" xmlns:wpi="http://schemas.microsoft.com/office/word/2010/wordprocessingInk" xmlns:wne="http://schemas.microsoft.com/office/word/2006/wordml" xmlns:wps="http://schemas.microsoft.com/office/word/2010/wordprocessingShape" mc:Ignorable="w14 w15 w16se w16cid w16 w16cex w16sdtdh w16sdtfl w16du wp14">
   <w:endnote w:type="separator" w:id="-1">
     <w:p>
       <w:r>
@@ -155,16 +137,13 @@
 </file>
 
 <file path=word/footer1.xml><?xml version="1.0" encoding="utf-8"?>
-<w:ftr xmlns:wpc="http://schemas.microsoft.com/office/word/2010/wordprocessingCanvas" xmlns:cx="http://schemas.microsoft.com/office/drawing/2014/chartex" xmlns:cx1="http://schemas.microsoft.com/office/drawing/2015/9/8/chartex" xmlns:cx2="http://schemas.microsoft.com/office/drawing/2015/10/21/chartex" xmlns:cx3="http://schemas.microsoft.com/office/drawing/2016/5/9/chartex" xmlns:cx4="http://schemas.microsoft.com/office/drawing/2016/5/10/chartex" xmlns:cx5="http://schemas.microsoft.com/office/drawing/2016/5/11/chartex" xmlns:cx6="http://schemas.microsoft.com/office/drawing/2016/5/12/chartex" xmlns:cx7="http://schemas.microsoft.com/office/drawing/2016/5/13/chartex" xmlns:cx8="http://schemas.microsoft.com/office/drawing/2016/5/14/chartex" xmlns:mc="http://schemas.openxmlformats.org/markup-compatibility/2006" xmlns:aink="http://schemas.microsoft.com/office/drawing/2016/ink" xmlns:am3d="http://schemas.microsoft.com/office/drawing/2017/model3d" xmlns:o="urn:schemas-microsoft-com:office:office" xmlns:oel="http://schemas.microsoft.com/office/2019/extlst" xmlns:r="http://schemas.openxmlformats.org/officeDocument/2006/relationships" xmlns:m="http://schemas.openxmlformats.org/officeDocument/2006/math" xmlns:v="urn:schemas-microsoft-com:vml" xmlns:wp14="http://schemas.microsoft.com/office/word/2010/wordprocessingDrawing" xmlns:wp="http://schemas.openxmlformats.org/drawingml/2006/wordprocessingDrawing" xmlns:w10="urn:schemas-microsoft-com:office:word" xmlns:w="http://schemas.openxmlformats.org/wordprocessingml/2006/main" xmlns:w14="http://schemas.microsoft.com/office/word/2010/wordml" xmlns:w15="http://schemas.microsoft.com/office/word/2012/wordml" xmlns:w16cex="http://schemas.microsoft.com/office/word/2018/wordml/cex" xmlns:w16cid="http://schemas.microsoft.com/office/word/2016/wordml/cid" xmlns:w16="http://schemas.microsoft.com/office/word/2018/wordml" xmlns:w16sdtdh="http://schemas.microsoft.com/office/word/2020/wordml/sdtdatahash" xmlns:w16se="http://schemas.microsoft.com/office/word/2015/wordml/symex" xmlns:wpg="http://schemas.microsoft.com/office/word/2010/wordprocessingGroup" xmlns:wpi="http://schemas.microsoft.com/office/word/2010/wordprocessingInk" xmlns:wne="http://schemas.microsoft.com/office/word/2006/wordml" xmlns:wps="http://schemas.microsoft.com/office/word/2010/wordprocessingShape" mc:Ignorable="w14 w15 w16se w16cid w16 w16cex w16sdtdh wp14">
+<w:ftr xmlns:wpc="http://schemas.microsoft.com/office/word/2010/wordprocessingCanvas" xmlns:cx="http://schemas.microsoft.com/office/drawing/2014/chartex" xmlns:cx1="http://schemas.microsoft.com/office/drawing/2015/9/8/chartex" xmlns:cx2="http://schemas.microsoft.com/office/drawing/2015/10/21/chartex" xmlns:cx3="http://schemas.microsoft.com/office/drawing/2016/5/9/chartex" xmlns:cx4="http://schemas.microsoft.com/office/drawing/2016/5/10/chartex" xmlns:cx5="http://schemas.microsoft.com/office/drawing/2016/5/11/chartex" xmlns:cx6="http://schemas.microsoft.com/office/drawing/2016/5/12/chartex" xmlns:cx7="http://schemas.microsoft.com/office/drawing/2016/5/13/chartex" xmlns:cx8="http://schemas.microsoft.com/office/drawing/2016/5/14/chartex" xmlns:mc="http://schemas.openxmlformats.org/markup-compatibility/2006" xmlns:aink="http://schemas.microsoft.com/office/drawing/2016/ink" xmlns:am3d="http://schemas.microsoft.com/office/drawing/2017/model3d" xmlns:o="urn:schemas-microsoft-com:office:office" xmlns:oel="http://schemas.microsoft.com/office/2019/extlst" xmlns:r="http://schemas.openxmlformats.org/officeDocument/2006/relationships" xmlns:m="http://schemas.openxmlformats.org/officeDocument/2006/math" xmlns:v="urn:schemas-microsoft-com:vml" xmlns:wp14="http://schemas.microsoft.com/office/word/2010/wordprocessingDrawing" xmlns:wp="http://schemas.openxmlformats.org/drawingml/2006/wordprocessingDrawing" xmlns:w10="urn:schemas-microsoft-com:office:word" xmlns:w="http://schemas.openxmlformats.org/wordprocessingml/2006/main" xmlns:w14="http://schemas.microsoft.com/office/word/2010/wordml" xmlns:w15="http://schemas.microsoft.com/office/word/2012/wordml" xmlns:w16cex="http://schemas.microsoft.com/office/word/2018/wordml/cex" xmlns:w16cid="http://schemas.microsoft.com/office/word/2016/wordml/cid" xmlns:w16="http://schemas.microsoft.com/office/word/2018/wordml" xmlns:w16du="http://schemas.microsoft.com/office/word/2023/wordml/word16du" xmlns:w16sdtdh="http://schemas.microsoft.com/office/word/2020/wordml/sdtdatahash" xmlns:w16sdtfl="http://schemas.microsoft.com/office/word/2024/wordml/sdtformatlock" xmlns:w16se="http://schemas.microsoft.com/office/word/2015/wordml/symex" xmlns:wpg="http://schemas.microsoft.com/office/word/2010/wordprocessingGroup" xmlns:wpi="http://schemas.microsoft.com/office/word/2010/wordprocessingInk" xmlns:wne="http://schemas.microsoft.com/office/word/2006/wordml" xmlns:wps="http://schemas.microsoft.com/office/word/2010/wordprocessingShape" mc:Ignorable="w14 w15 w16se w16cid w16 w16cex w16sdtdh w16sdtfl w16du wp14">
   <w:sdt>
     <w:sdtPr>
       <w:rPr>
         <w:rStyle w:val="ae"/>
       </w:rPr>
       <w:id w:val="-1273542849"/>
-      <w:docPartObj>
-        <w:docPartGallery w:val="AutoText"/>
-      </w:docPartObj>
     </w:sdtPr>
     <w:sdtContent>
       <w:p>
@@ -202,9 +181,6 @@
         <w:rStyle w:val="ae"/>
       </w:rPr>
       <w:id w:val="-528495556"/>
-      <w:docPartObj>
-        <w:docPartGallery w:val="AutoText"/>
-      </w:docPartObj>
     </w:sdtPr>
     <w:sdtContent>
       <w:p>
@@ -247,16 +223,13 @@
 </file>
 
 <file path=word/footer2.xml><?xml version="1.0" encoding="utf-8"?>
-<w:ftr xmlns:wpc="http://schemas.microsoft.com/office/word/2010/wordprocessingCanvas" xmlns:cx="http://schemas.microsoft.com/office/drawing/2014/chartex" xmlns:cx1="http://schemas.microsoft.com/office/drawing/2015/9/8/chartex" xmlns:cx2="http://schemas.microsoft.com/office/drawing/2015/10/21/chartex" xmlns:cx3="http://schemas.microsoft.com/office/drawing/2016/5/9/chartex" xmlns:cx4="http://schemas.microsoft.com/office/drawing/2016/5/10/chartex" xmlns:cx5="http://schemas.microsoft.com/office/drawing/2016/5/11/chartex" xmlns:cx6="http://schemas.microsoft.com/office/drawing/2016/5/12/chartex" xmlns:cx7="http://schemas.microsoft.com/office/drawing/2016/5/13/chartex" xmlns:cx8="http://schemas.microsoft.com/office/drawing/2016/5/14/chartex" xmlns:mc="http://schemas.openxmlformats.org/markup-compatibility/2006" xmlns:aink="http://schemas.microsoft.com/office/drawing/2016/ink" xmlns:am3d="http://schemas.microsoft.com/office/drawing/2017/model3d" xmlns:o="urn:schemas-microsoft-com:office:office" xmlns:oel="http://schemas.microsoft.com/office/2019/extlst" xmlns:r="http://schemas.openxmlformats.org/officeDocument/2006/relationships" xmlns:m="http://schemas.openxmlformats.org/officeDocument/2006/math" xmlns:v="urn:schemas-microsoft-com:vml" xmlns:wp14="http://schemas.microsoft.com/office/word/2010/wordprocessingDrawing" xmlns:wp="http://schemas.openxmlformats.org/drawingml/2006/wordprocessingDrawing" xmlns:w10="urn:schemas-microsoft-com:office:word" xmlns:w="http://schemas.openxmlformats.org/wordprocessingml/2006/main" xmlns:w14="http://schemas.microsoft.com/office/word/2010/wordml" xmlns:w15="http://schemas.microsoft.com/office/word/2012/wordml" xmlns:w16cex="http://schemas.microsoft.com/office/word/2018/wordml/cex" xmlns:w16cid="http://schemas.microsoft.com/office/word/2016/wordml/cid" xmlns:w16="http://schemas.microsoft.com/office/word/2018/wordml" xmlns:w16sdtdh="http://schemas.microsoft.com/office/word/2020/wordml/sdtdatahash" xmlns:w16se="http://schemas.microsoft.com/office/word/2015/wordml/symex" xmlns:wpg="http://schemas.microsoft.com/office/word/2010/wordprocessingGroup" xmlns:wpi="http://schemas.microsoft.com/office/word/2010/wordprocessingInk" xmlns:wne="http://schemas.microsoft.com/office/word/2006/wordml" xmlns:wps="http://schemas.microsoft.com/office/word/2010/wordprocessingShape" mc:Ignorable="w14 w15 w16se w16cid w16 w16cex w16sdtdh wp14">
+<w:ftr xmlns:wpc="http://schemas.microsoft.com/office/word/2010/wordprocessingCanvas" xmlns:cx="http://schemas.microsoft.com/office/drawing/2014/chartex" xmlns:cx1="http://schemas.microsoft.com/office/drawing/2015/9/8/chartex" xmlns:cx2="http://schemas.microsoft.com/office/drawing/2015/10/21/chartex" xmlns:cx3="http://schemas.microsoft.com/office/drawing/2016/5/9/chartex" xmlns:cx4="http://schemas.microsoft.com/office/drawing/2016/5/10/chartex" xmlns:cx5="http://schemas.microsoft.com/office/drawing/2016/5/11/chartex" xmlns:cx6="http://schemas.microsoft.com/office/drawing/2016/5/12/chartex" xmlns:cx7="http://schemas.microsoft.com/office/drawing/2016/5/13/chartex" xmlns:cx8="http://schemas.microsoft.com/office/drawing/2016/5/14/chartex" xmlns:mc="http://schemas.openxmlformats.org/markup-compatibility/2006" xmlns:aink="http://schemas.microsoft.com/office/drawing/2016/ink" xmlns:am3d="http://schemas.microsoft.com/office/drawing/2017/model3d" xmlns:o="urn:schemas-microsoft-com:office:office" xmlns:oel="http://schemas.microsoft.com/office/2019/extlst" xmlns:r="http://schemas.openxmlformats.org/officeDocument/2006/relationships" xmlns:m="http://schemas.openxmlformats.org/officeDocument/2006/math" xmlns:v="urn:schemas-microsoft-com:vml" xmlns:wp14="http://schemas.microsoft.com/office/word/2010/wordprocessingDrawing" xmlns:wp="http://schemas.openxmlformats.org/drawingml/2006/wordprocessingDrawing" xmlns:w10="urn:schemas-microsoft-com:office:word" xmlns:w="http://schemas.openxmlformats.org/wordprocessingml/2006/main" xmlns:w14="http://schemas.microsoft.com/office/word/2010/wordml" xmlns:w15="http://schemas.microsoft.com/office/word/2012/wordml" xmlns:w16cex="http://schemas.microsoft.com/office/word/2018/wordml/cex" xmlns:w16cid="http://schemas.microsoft.com/office/word/2016/wordml/cid" xmlns:w16="http://schemas.microsoft.com/office/word/2018/wordml" xmlns:w16du="http://schemas.microsoft.com/office/word/2023/wordml/word16du" xmlns:w16sdtdh="http://schemas.microsoft.com/office/word/2020/wordml/sdtdatahash" xmlns:w16sdtfl="http://schemas.microsoft.com/office/word/2024/wordml/sdtformatlock" xmlns:w16se="http://schemas.microsoft.com/office/word/2015/wordml/symex" xmlns:wpg="http://schemas.microsoft.com/office/word/2010/wordprocessingGroup" xmlns:wpi="http://schemas.microsoft.com/office/word/2010/wordprocessingInk" xmlns:wne="http://schemas.microsoft.com/office/word/2006/wordml" xmlns:wps="http://schemas.microsoft.com/office/word/2010/wordprocessingShape" mc:Ignorable="w14 w15 w16se w16cid w16 w16cex w16sdtdh w16sdtfl w16du wp14">
   <w:sdt>
     <w:sdtPr>
       <w:rPr>
         <w:rStyle w:val="ae"/>
       </w:rPr>
       <w:id w:val="-1"/>
-      <w:docPartObj>
-        <w:docPartGallery w:val="AutoText"/>
-      </w:docPartObj>
     </w:sdtPr>
     <w:sdtContent>
       <w:p>
@@ -378,7 +351,7 @@
 </file>
 
 <file path=word/footnotes.xml><?xml version="1.0" encoding="utf-8"?>
-<w:footnotes xmlns:wpc="http://schemas.microsoft.com/office/word/2010/wordprocessingCanvas" xmlns:cx="http://schemas.microsoft.com/office/drawing/2014/chartex" xmlns:cx1="http://schemas.microsoft.com/office/drawing/2015/9/8/chartex" xmlns:cx2="http://schemas.microsoft.com/office/drawing/2015/10/21/chartex" xmlns:cx3="http://schemas.microsoft.com/office/drawing/2016/5/9/chartex" xmlns:cx4="http://schemas.microsoft.com/office/drawing/2016/5/10/chartex" xmlns:cx5="http://schemas.microsoft.com/office/drawing/2016/5/11/chartex" xmlns:cx6="http://schemas.microsoft.com/office/drawing/2016/5/12/chartex" xmlns:cx7="http://schemas.microsoft.com/office/drawing/2016/5/13/chartex" xmlns:cx8="http://schemas.microsoft.com/office/drawing/2016/5/14/chartex" xmlns:mc="http://schemas.openxmlformats.org/markup-compatibility/2006" xmlns:aink="http://schemas.microsoft.com/office/drawing/2016/ink" xmlns:am3d="http://schemas.microsoft.com/office/drawing/2017/model3d" xmlns:o="urn:schemas-microsoft-com:office:office" xmlns:oel="http://schemas.microsoft.com/office/2019/extlst" xmlns:r="http://schemas.openxmlformats.org/officeDocument/2006/relationships" xmlns:m="http://schemas.openxmlformats.org/officeDocument/2006/math" xmlns:v="urn:schemas-microsoft-com:vml" xmlns:wp14="http://schemas.microsoft.com/office/word/2010/wordprocessingDrawing" xmlns:wp="http://schemas.openxmlformats.org/drawingml/2006/wordprocessingDrawing" xmlns:w10="urn:schemas-microsoft-com:office:word" xmlns:w="http://schemas.openxmlformats.org/wordprocessingml/2006/main" xmlns:w14="http://schemas.microsoft.com/office/word/2010/wordml" xmlns:w15="http://schemas.microsoft.com/office/word/2012/wordml" xmlns:w16cex="http://schemas.microsoft.com/office/word/2018/wordml/cex" xmlns:w16cid="http://schemas.microsoft.com/office/word/2016/wordml/cid" xmlns:w16="http://schemas.microsoft.com/office/word/2018/wordml" xmlns:w16sdtdh="http://schemas.microsoft.com/office/word/2020/wordml/sdtdatahash" xmlns:w16se="http://schemas.microsoft.com/office/word/2015/wordml/symex" xmlns:wpg="http://schemas.microsoft.com/office/word/2010/wordprocessingGroup" xmlns:wpi="http://schemas.microsoft.com/office/word/2010/wordprocessingInk" xmlns:wne="http://schemas.microsoft.com/office/word/2006/wordml" xmlns:wps="http://schemas.microsoft.com/office/word/2010/wordprocessingShape" mc:Ignorable="w14 w15 w16se w16cid w16 w16cex w16sdtdh wp14">
+<w:footnotes xmlns:wpc="http://schemas.microsoft.com/office/word/2010/wordprocessingCanvas" xmlns:cx="http://schemas.microsoft.com/office/drawing/2014/chartex" xmlns:cx1="http://schemas.microsoft.com/office/drawing/2015/9/8/chartex" xmlns:cx2="http://schemas.microsoft.com/office/drawing/2015/10/21/chartex" xmlns:cx3="http://schemas.microsoft.com/office/drawing/2016/5/9/chartex" xmlns:cx4="http://schemas.microsoft.com/office/drawing/2016/5/10/chartex" xmlns:cx5="http://schemas.microsoft.com/office/drawing/2016/5/11/chartex" xmlns:cx6="http://schemas.microsoft.com/office/drawing/2016/5/12/chartex" xmlns:cx7="http://schemas.microsoft.com/office/drawing/2016/5/13/chartex" xmlns:cx8="http://schemas.microsoft.com/office/drawing/2016/5/14/chartex" xmlns:mc="http://schemas.openxmlformats.org/markup-compatibility/2006" xmlns:aink="http://schemas.microsoft.com/office/drawing/2016/ink" xmlns:am3d="http://schemas.microsoft.com/office/drawing/2017/model3d" xmlns:o="urn:schemas-microsoft-com:office:office" xmlns:oel="http://schemas.microsoft.com/office/2019/extlst" xmlns:r="http://schemas.openxmlformats.org/officeDocument/2006/relationships" xmlns:m="http://schemas.openxmlformats.org/officeDocument/2006/math" xmlns:v="urn:schemas-microsoft-com:vml" xmlns:wp14="http://schemas.microsoft.com/office/word/2010/wordprocessingDrawing" xmlns:wp="http://schemas.openxmlformats.org/drawingml/2006/wordprocessingDrawing" xmlns:w10="urn:schemas-microsoft-com:office:word" xmlns:w="http://schemas.openxmlformats.org/wordprocessingml/2006/main" xmlns:w14="http://schemas.microsoft.com/office/word/2010/wordml" xmlns:w15="http://schemas.microsoft.com/office/word/2012/wordml" xmlns:w16cex="http://schemas.microsoft.com/office/word/2018/wordml/cex" xmlns:w16cid="http://schemas.microsoft.com/office/word/2016/wordml/cid" xmlns:w16="http://schemas.microsoft.com/office/word/2018/wordml" xmlns:w16du="http://schemas.microsoft.com/office/word/2023/wordml/word16du" xmlns:w16sdtdh="http://schemas.microsoft.com/office/word/2020/wordml/sdtdatahash" xmlns:w16sdtfl="http://schemas.microsoft.com/office/word/2024/wordml/sdtformatlock" xmlns:w16se="http://schemas.microsoft.com/office/word/2015/wordml/symex" xmlns:wpg="http://schemas.microsoft.com/office/word/2010/wordprocessingGroup" xmlns:wpi="http://schemas.microsoft.com/office/word/2010/wordprocessingInk" xmlns:wne="http://schemas.microsoft.com/office/word/2006/wordml" xmlns:wps="http://schemas.microsoft.com/office/word/2010/wordprocessingShape" mc:Ignorable="w14 w15 w16se w16cid w16 w16cex w16sdtdh w16sdtfl w16du wp14">
   <w:footnote w:type="separator" w:id="-1">
     <w:p>
       <w:r>
@@ -396,8 +369,129 @@
 </w:footnotes>
 </file>
 
+<file path=word/numbering.xml><?xml version="1.0" encoding="utf-8"?>
+<w:numbering xmlns:wpc="http://schemas.microsoft.com/office/word/2010/wordprocessingCanvas" xmlns:cx="http://schemas.microsoft.com/office/drawing/2014/chartex" xmlns:cx1="http://schemas.microsoft.com/office/drawing/2015/9/8/chartex" xmlns:cx2="http://schemas.microsoft.com/office/drawing/2015/10/21/chartex" xmlns:cx3="http://schemas.microsoft.com/office/drawing/2016/5/9/chartex" xmlns:cx4="http://schemas.microsoft.com/office/drawing/2016/5/10/chartex" xmlns:cx5="http://schemas.microsoft.com/office/drawing/2016/5/11/chartex" xmlns:cx6="http://schemas.microsoft.com/office/drawing/2016/5/12/chartex" xmlns:cx7="http://schemas.microsoft.com/office/drawing/2016/5/13/chartex" xmlns:cx8="http://schemas.microsoft.com/office/drawing/2016/5/14/chartex" xmlns:mc="http://schemas.openxmlformats.org/markup-compatibility/2006" xmlns:aink="http://schemas.microsoft.com/office/drawing/2016/ink" xmlns:am3d="http://schemas.microsoft.com/office/drawing/2017/model3d" xmlns:o="urn:schemas-microsoft-com:office:office" xmlns:oel="http://schemas.microsoft.com/office/2019/extlst" xmlns:r="http://schemas.openxmlformats.org/officeDocument/2006/relationships" xmlns:m="http://schemas.openxmlformats.org/officeDocument/2006/math" xmlns:v="urn:schemas-microsoft-com:vml" xmlns:wp14="http://schemas.microsoft.com/office/word/2010/wordprocessingDrawing" xmlns:wp="http://schemas.openxmlformats.org/drawingml/2006/wordprocessingDrawing" xmlns:w10="urn:schemas-microsoft-com:office:word" xmlns:w="http://schemas.openxmlformats.org/wordprocessingml/2006/main" xmlns:w14="http://schemas.microsoft.com/office/word/2010/wordml" xmlns:w15="http://schemas.microsoft.com/office/word/2012/wordml" xmlns:w16cex="http://schemas.microsoft.com/office/word/2018/wordml/cex" xmlns:w16cid="http://schemas.microsoft.com/office/word/2016/wordml/cid" xmlns:w16="http://schemas.microsoft.com/office/word/2018/wordml" xmlns:w16du="http://schemas.microsoft.com/office/word/2023/wordml/word16du" xmlns:w16sdtdh="http://schemas.microsoft.com/office/word/2020/wordml/sdtdatahash" xmlns:w16sdtfl="http://schemas.microsoft.com/office/word/2024/wordml/sdtformatlock" xmlns:w16se="http://schemas.microsoft.com/office/word/2015/wordml/symex" xmlns:wpg="http://schemas.microsoft.com/office/word/2010/wordprocessingGroup" xmlns:wpi="http://schemas.microsoft.com/office/word/2010/wordprocessingInk" xmlns:wne="http://schemas.microsoft.com/office/word/2006/wordml" xmlns:wps="http://schemas.microsoft.com/office/word/2010/wordprocessingShape" mc:Ignorable="w14 w15 w16se w16cid w16 w16cex w16sdtdh w16sdtfl w16du wp14">
+  <w:abstractNum w:abstractNumId="0" w15:restartNumberingAfterBreak="0">
+    <w:nsid w:val="42F61950"/>
+    <w:multiLevelType w:val="multilevel"/>
+    <w:tmpl w:val="42F61950"/>
+    <w:lvl w:ilvl="0">
+      <w:start w:val="1"/>
+      <w:numFmt w:val="bullet"/>
+      <w:lvlText w:val="•"/>
+      <w:lvlJc w:val="left"/>
+      <w:pPr>
+        <w:ind w:left="440" w:hanging="440"/>
+      </w:pPr>
+      <w:rPr>
+        <w:rFonts w:ascii="DengXian" w:eastAsia="DengXian" w:hAnsi="DengXian" w:hint="eastAsia"/>
+      </w:rPr>
+    </w:lvl>
+    <w:lvl w:ilvl="1">
+      <w:start w:val="1"/>
+      <w:numFmt w:val="bullet"/>
+      <w:lvlText w:val=""/>
+      <w:lvlJc w:val="left"/>
+      <w:pPr>
+        <w:ind w:left="880" w:hanging="440"/>
+      </w:pPr>
+      <w:rPr>
+        <w:rFonts w:ascii="Wingdings" w:hAnsi="Wingdings" w:hint="default"/>
+      </w:rPr>
+    </w:lvl>
+    <w:lvl w:ilvl="2">
+      <w:start w:val="1"/>
+      <w:numFmt w:val="bullet"/>
+      <w:lvlText w:val=""/>
+      <w:lvlJc w:val="left"/>
+      <w:pPr>
+        <w:ind w:left="1320" w:hanging="440"/>
+      </w:pPr>
+      <w:rPr>
+        <w:rFonts w:ascii="Wingdings" w:hAnsi="Wingdings" w:hint="default"/>
+      </w:rPr>
+    </w:lvl>
+    <w:lvl w:ilvl="3">
+      <w:start w:val="1"/>
+      <w:numFmt w:val="bullet"/>
+      <w:lvlText w:val=""/>
+      <w:lvlJc w:val="left"/>
+      <w:pPr>
+        <w:ind w:left="1760" w:hanging="440"/>
+      </w:pPr>
+      <w:rPr>
+        <w:rFonts w:ascii="Wingdings" w:hAnsi="Wingdings" w:hint="default"/>
+      </w:rPr>
+    </w:lvl>
+    <w:lvl w:ilvl="4">
+      <w:start w:val="1"/>
+      <w:numFmt w:val="bullet"/>
+      <w:lvlText w:val=""/>
+      <w:lvlJc w:val="left"/>
+      <w:pPr>
+        <w:ind w:left="2200" w:hanging="440"/>
+      </w:pPr>
+      <w:rPr>
+        <w:rFonts w:ascii="Wingdings" w:hAnsi="Wingdings" w:hint="default"/>
+      </w:rPr>
+    </w:lvl>
+    <w:lvl w:ilvl="5">
+      <w:start w:val="1"/>
+      <w:numFmt w:val="bullet"/>
+      <w:lvlText w:val=""/>
+      <w:lvlJc w:val="left"/>
+      <w:pPr>
+        <w:ind w:left="2640" w:hanging="440"/>
+      </w:pPr>
+      <w:rPr>
+        <w:rFonts w:ascii="Wingdings" w:hAnsi="Wingdings" w:hint="default"/>
+      </w:rPr>
+    </w:lvl>
+    <w:lvl w:ilvl="6">
+      <w:start w:val="1"/>
+      <w:numFmt w:val="bullet"/>
+      <w:lvlText w:val=""/>
+      <w:lvlJc w:val="left"/>
+      <w:pPr>
+        <w:ind w:left="3080" w:hanging="440"/>
+      </w:pPr>
+      <w:rPr>
+        <w:rFonts w:ascii="Wingdings" w:hAnsi="Wingdings" w:hint="default"/>
+      </w:rPr>
+    </w:lvl>
+    <w:lvl w:ilvl="7">
+      <w:start w:val="1"/>
+      <w:numFmt w:val="bullet"/>
+      <w:lvlText w:val=""/>
+      <w:lvlJc w:val="left"/>
+      <w:pPr>
+        <w:ind w:left="3520" w:hanging="440"/>
+      </w:pPr>
+      <w:rPr>
+        <w:rFonts w:ascii="Wingdings" w:hAnsi="Wingdings" w:hint="default"/>
+      </w:rPr>
+    </w:lvl>
+    <w:lvl w:ilvl="8">
+      <w:start w:val="1"/>
+      <w:numFmt w:val="bullet"/>
+      <w:lvlText w:val=""/>
+      <w:lvlJc w:val="left"/>
+      <w:pPr>
+        <w:ind w:left="3960" w:hanging="440"/>
+      </w:pPr>
+      <w:rPr>
+        <w:rFonts w:ascii="Wingdings" w:hAnsi="Wingdings" w:hint="default"/>
+      </w:rPr>
+    </w:lvl>
+  </w:abstractNum>
+  <w:num w:numId="1" w16cid:durableId="752436300">
+    <w:abstractNumId w:val="0"/>
+  </w:num>
+</w:numbering>
+</file>
+
 <file path=word/styles.xml><?xml version="1.0" encoding="utf-8"?>
-<w:styles xmlns:mc="http://schemas.openxmlformats.org/markup-compatibility/2006" xmlns:r="http://schemas.openxmlformats.org/officeDocument/2006/relationships" xmlns:w="http://schemas.openxmlformats.org/wordprocessingml/2006/main" xmlns:w14="http://schemas.microsoft.com/office/word/2010/wordml" xmlns:w15="http://schemas.microsoft.com/office/word/2012/wordml" xmlns:w16cex="http://schemas.microsoft.com/office/word/2018/wordml/cex" xmlns:w16cid="http://schemas.microsoft.com/office/word/2016/wordml/cid" xmlns:w16="http://schemas.microsoft.com/office/word/2018/wordml" xmlns:w16sdtdh="http://schemas.microsoft.com/office/word/2020/wordml/sdtdatahash" xmlns:w16se="http://schemas.microsoft.com/office/word/2015/wordml/symex" mc:Ignorable="w14 w15 w16se w16cid w16 w16cex w16sdtdh">
+<w:styles xmlns:mc="http://schemas.openxmlformats.org/markup-compatibility/2006" xmlns:r="http://schemas.openxmlformats.org/officeDocument/2006/relationships" xmlns:w="http://schemas.openxmlformats.org/wordprocessingml/2006/main" xmlns:w14="http://schemas.microsoft.com/office/word/2010/wordml" xmlns:w15="http://schemas.microsoft.com/office/word/2012/wordml" xmlns:w16cex="http://schemas.microsoft.com/office/word/2018/wordml/cex" xmlns:w16cid="http://schemas.microsoft.com/office/word/2016/wordml/cid" xmlns:w16="http://schemas.microsoft.com/office/word/2018/wordml" xmlns:w16du="http://schemas.microsoft.com/office/word/2023/wordml/word16du" xmlns:w16sdtdh="http://schemas.microsoft.com/office/word/2020/wordml/sdtdatahash" xmlns:w16sdtfl="http://schemas.microsoft.com/office/word/2024/wordml/sdtformatlock" xmlns:w16se="http://schemas.microsoft.com/office/word/2015/wordml/symex" mc:Ignorable="w14 w15 w16se w16cid w16 w16cex w16sdtdh w16sdtfl w16du">
   <w:docDefaults>
     <w:rPrDefault>
       <w:rPr>
@@ -787,11 +881,12 @@
   <w:style w:type="paragraph" w:default="1" w:styleId="a">
     <w:name w:val="Normal"/>
     <w:qFormat/>
+    <w:rsid w:val="00EF4E71"/>
     <w:pPr>
       <w:jc w:val="both"/>
     </w:pPr>
     <w:rPr>
-      <w:rFonts w:ascii="Arial" w:eastAsia="Songti SC" w:hAnsi="Arial"/>
+      <w:rFonts w:ascii="Times New Roman" w:eastAsia="宋体" w:hAnsi="Times New Roman"/>
       <w:sz w:val="24"/>
       <w:szCs w:val="24"/>
       <w:lang w:eastAsia="en-US"/>
@@ -804,6 +899,7 @@
     <w:link w:val="10"/>
     <w:uiPriority w:val="9"/>
     <w:qFormat/>
+    <w:rsid w:val="00EF4E71"/>
     <w:pPr>
       <w:keepNext/>
       <w:keepLines/>
@@ -831,6 +927,7 @@
     <w:uiPriority w:val="9"/>
     <w:unhideWhenUsed/>
     <w:qFormat/>
+    <w:rsid w:val="00A87EF8"/>
     <w:pPr>
       <w:keepNext/>
       <w:keepLines/>
@@ -841,7 +938,7 @@
       <w:rFonts w:eastAsiaTheme="majorEastAsia" w:cstheme="majorBidi"/>
       <w:b/>
       <w:bCs/>
-      <w:sz w:val="36"/>
+      <w:sz w:val="28"/>
       <w:szCs w:val="26"/>
     </w:rPr>
   </w:style>
@@ -853,6 +950,7 @@
     <w:uiPriority w:val="9"/>
     <w:unhideWhenUsed/>
     <w:qFormat/>
+    <w:rsid w:val="00A87EF8"/>
     <w:pPr>
       <w:keepNext/>
       <w:keepLines/>
@@ -863,7 +961,7 @@
       <w:rFonts w:eastAsiaTheme="majorEastAsia" w:cstheme="majorBidi"/>
       <w:b/>
       <w:bCs/>
-      <w:sz w:val="32"/>
+      <w:sz w:val="28"/>
     </w:rPr>
   </w:style>
   <w:style w:type="paragraph" w:styleId="4">
@@ -1199,12 +1297,14 @@
     <w:basedOn w:val="a0"/>
     <w:link w:val="1"/>
     <w:uiPriority w:val="9"/>
-    <w:rPr>
-      <w:rFonts w:ascii="Arial" w:eastAsiaTheme="majorEastAsia" w:hAnsi="Arial" w:cstheme="majorBidi"/>
+    <w:rsid w:val="00EF4E71"/>
+    <w:rPr>
+      <w:rFonts w:ascii="Times New Roman" w:eastAsiaTheme="majorEastAsia" w:hAnsi="Times New Roman" w:cstheme="majorBidi"/>
       <w:b/>
       <w:bCs/>
       <w:sz w:val="44"/>
       <w:szCs w:val="32"/>
+      <w:lang w:eastAsia="en-US"/>
     </w:rPr>
   </w:style>
   <w:style w:type="character" w:customStyle="1" w:styleId="20">
@@ -1212,12 +1312,14 @@
     <w:basedOn w:val="a0"/>
     <w:link w:val="2"/>
     <w:uiPriority w:val="9"/>
-    <w:rPr>
-      <w:rFonts w:ascii="Arial" w:eastAsiaTheme="majorEastAsia" w:hAnsi="Arial" w:cstheme="majorBidi"/>
+    <w:rsid w:val="00A87EF8"/>
+    <w:rPr>
+      <w:rFonts w:ascii="Times New Roman" w:eastAsiaTheme="majorEastAsia" w:hAnsi="Times New Roman" w:cstheme="majorBidi"/>
       <w:b/>
       <w:bCs/>
-      <w:sz w:val="36"/>
+      <w:sz w:val="28"/>
       <w:szCs w:val="26"/>
+      <w:lang w:eastAsia="en-US"/>
     </w:rPr>
   </w:style>
   <w:style w:type="character" w:customStyle="1" w:styleId="30">
@@ -1225,11 +1327,14 @@
     <w:basedOn w:val="a0"/>
     <w:link w:val="3"/>
     <w:uiPriority w:val="9"/>
-    <w:rPr>
-      <w:rFonts w:ascii="Arial" w:eastAsiaTheme="majorEastAsia" w:hAnsi="Arial" w:cstheme="majorBidi"/>
+    <w:rsid w:val="00A87EF8"/>
+    <w:rPr>
+      <w:rFonts w:ascii="Times New Roman" w:eastAsiaTheme="majorEastAsia" w:hAnsi="Times New Roman" w:cstheme="majorBidi"/>
       <w:b/>
       <w:bCs/>
-      <w:sz w:val="32"/>
+      <w:sz w:val="28"/>
+      <w:szCs w:val="24"/>
+      <w:lang w:eastAsia="en-US"/>
     </w:rPr>
   </w:style>
   <w:style w:type="paragraph" w:customStyle="1" w:styleId="ImageCaption">
@@ -1351,6 +1456,68 @@
       <w:ind w:left="720"/>
       <w:contextualSpacing/>
     </w:pPr>
+  </w:style>
+  <w:style w:type="table" w:customStyle="1" w:styleId="ListTable6Colorful1">
+    <w:name w:val="List Table 6 Colorful1"/>
+    <w:basedOn w:val="a1"/>
+    <w:uiPriority w:val="51"/>
+    <w:rPr>
+      <w:color w:val="000000" w:themeColor="text1"/>
+    </w:rPr>
+    <w:tblPr>
+      <w:tblBorders>
+        <w:top w:val="single" w:sz="4" w:space="0" w:color="000000" w:themeColor="text1"/>
+        <w:bottom w:val="single" w:sz="4" w:space="0" w:color="000000" w:themeColor="text1"/>
+      </w:tblBorders>
+    </w:tblPr>
+    <w:tblStylePr w:type="firstRow">
+      <w:rPr>
+        <w:b/>
+        <w:bCs/>
+      </w:rPr>
+      <w:tblPr/>
+      <w:tcPr>
+        <w:tcBorders>
+          <w:bottom w:val="single" w:sz="4" w:space="0" w:color="000000" w:themeColor="text1"/>
+        </w:tcBorders>
+      </w:tcPr>
+    </w:tblStylePr>
+    <w:tblStylePr w:type="lastRow">
+      <w:rPr>
+        <w:b/>
+        <w:bCs/>
+      </w:rPr>
+      <w:tblPr/>
+      <w:tcPr>
+        <w:tcBorders>
+          <w:top w:val="double" w:sz="4" w:space="0" w:color="000000" w:themeColor="text1"/>
+        </w:tcBorders>
+      </w:tcPr>
+    </w:tblStylePr>
+    <w:tblStylePr w:type="firstCol">
+      <w:rPr>
+        <w:b/>
+        <w:bCs/>
+      </w:rPr>
+    </w:tblStylePr>
+    <w:tblStylePr w:type="lastCol">
+      <w:rPr>
+        <w:b/>
+        <w:bCs/>
+      </w:rPr>
+    </w:tblStylePr>
+    <w:tblStylePr w:type="band1Vert">
+      <w:tblPr/>
+      <w:tcPr>
+        <w:shd w:val="clear" w:color="auto" w:fill="CCCCCC" w:themeFill="text1" w:themeFillTint="33"/>
+      </w:tcPr>
+    </w:tblStylePr>
+    <w:tblStylePr w:type="band1Horz">
+      <w:tblPr/>
+      <w:tcPr>
+        <w:shd w:val="clear" w:color="auto" w:fill="CCCCCC" w:themeFill="text1" w:themeFillTint="33"/>
+      </w:tcPr>
+    </w:tblStylePr>
   </w:style>
 </w:styles>
 </file>

</xml_diff>